<commit_message>
docs(S9): aplica correccion de motor PostgreSQL en su ubicacion y elimina carpeta/ZIP duplicados
</commit_message>
<xml_diff>
--- a/S2_Documento_Proyecto_GuillermoVivas.docx
+++ b/S2_Documento_Proyecto_GuillermoVivas.docx
@@ -2173,7 +2173,7 @@
         <w:spacing w:after="150"/>
       </w:pPr>
       <w:r>
-        <w:t xml:space="preserve">La solución sigue una arquitectura cliente-servidor de tres capas, alineada con las tecnologías mínimas exigidas por la guía (React, Node.js + Express, MySQL, API REST).</w:t>
+        <w:t>La solución sigue una arquitectura cliente-servidor de tres capas, alineada con las tecnologías mínimas definidas para el proyecto (React, Node.js + Express, PostgreSQL, API REST).</w:t>
       </w:r>
     </w:p>
     <w:p>
@@ -2283,7 +2283,7 @@
         <w:spacing w:after="80"/>
       </w:pPr>
       <w:r>
-        <w:t xml:space="preserve">Base de datos (MySQL): almacena las entidades Proveedor, MateriaPrima, LoteProduccion y Usuario, accedida desde el backend mediante el driver mysql2.</w:t>
+        <w:t>Base de datos (PostgreSQL): almacena las entidades Proveedor, MateriaPrima, LoteProduccion y Usuario, accedida desde el backend mediante el driver pg (node-postgres). Nota: el diseño inicial de esta semana contemplaba MySQL (driver mysql2); en la Semana 3 se eligió PostgreSQL, ambos admitidos entre las tecnologías base del proyecto.</w:t>
       </w:r>
     </w:p>
     <w:p>

</xml_diff>